<commit_message>
docs: define two-bin system boundary
</commit_message>
<xml_diff>
--- a/outputs/BinSight_Final_Proposal.docx
+++ b/outputs/BinSight_Final_Proposal.docx
@@ -29,7 +29,7 @@
           <w:color w:val="00A7B5"/>
           <w:sz w:val="28"/>
         </w:rPr>
-        <w:t>Smart waste sensing, recycling-return validation and route simulation</w:t>
+        <w:t>General-waste sensing, recycling vision and route simulation</w:t>
       </w:r>
     </w:p>
     <w:p>
@@ -58,7 +58,7 @@
           <w:color w:val="344054"/>
           <w:sz w:val="18"/>
         </w:rPr>
-        <w:t>Three sensor bins | QR return station | Local decision hub | Fixed-vs-priority route simulation</w:t>
+        <w:t>Three general-waste bins | Vision-enabled recycling return | Decision hub | Route simulation</w:t>
       </w:r>
     </w:p>
     <w:p>
@@ -150,7 +150,7 @@
           <w:color w:val="101828"/>
           <w:sz w:val="20"/>
         </w:rPr>
-        <w:t>BinSight is a street-block prototype with three smart bins, one return station and hub. Focus A instruments each bin with a Teensy 4.1 running FreeRTOS for deterministic ultrasonic/load-cell polling, LED states, watchdog recovery and confidence flags for blocked or noisy readings. Focus C uses a Raspberry Pi/laptop hub to log sensor and QR events, estimate time-to-overflow with a tree-based model, rank pickups and compare fixed schedules against priority routes. Focus B adds a camera classifier that accepts plastic, metal and glass, then rejects non-recyclables before they enter the stream. Focus D builds an ESP32 return station following Singapore's Beverage Container Return Scheme / Return Right RVM flow with QR session, chute/servo feedback, dashboard logs and a simulated refund.</w:t>
+        <w:t>BinSight has two hardware paths. Focus A instruments three general-waste bins using one Teensy 4.1 and FreeRTOS for scheduled ultrasonic/load-cell sensing, watchdog recovery, fault flags and fill telemetry through an ESP32-C3 Wi-Fi relay. Focus C's laptop hub logs readings, estimates time-to-overflow with a tree-based model, ranks pickups and compares fixed schedules with priority routes. Focus B adds vision only to the recycling-return station: an OV5647 camera feeds Grove Vision AI V2 for local classification. Focus D's dedicated ESP32-C3 relays class, confidence and timing, manages the QR session and commands chute/servo feedback; it does not run the model. Accepted plastic, metal and glass items are logged for a simulated refund, while non-recyclables are rejected.</w:t>
       </w:r>
     </w:p>
     <w:p>

</xml_diff>